<commit_message>
Extender el cierre de la convocatoria AURA al 10 de noviembre de 2026.
El plazo de carga pasa de las 24:00 del 30 de octubre a las 24:00 del 10 de noviembre (Argentina), y la evaluación se recorre al 11–21 de noviembre para no solaparse con la presentación.

Co-authored-by: Cursor <cursoragent@cursor.com>
</commit_message>
<xml_diff>
--- a/documentos/Convocatoria_Proyectos_AURA.docx
+++ b/documentos/Convocatoria_Proyectos_AURA.docx
@@ -1140,13 +1140,12 @@
                 <w:szCs w:val="20"/>
                 <w:rtl w:val="0"/>
               </w:rPr>
-              <w:t xml:space="preserve">15 de septiembre al </w:t>
-            </w:r>
-            <w:r>
-              <w:rPr>
-                <w:rtl w:val="0"/>
-              </w:rPr>
-              <w:t xml:space="preserve">02</w:t>
+              <w:t>15 de septiembre al 10 de noviembre de 2026</w:t>
+            </w:r>
+            <w:r>
+              <w:rPr>
+                <w:rtl w:val="0"/>
+              </w:rPr>
             </w:r>
             <w:r>
               <w:rPr>
@@ -1157,13 +1156,11 @@
                 <w:szCs w:val="20"/>
                 <w:rtl w:val="0"/>
               </w:rPr>
-              <w:t xml:space="preserve"> de </w:t>
-            </w:r>
-            <w:r>
-              <w:rPr>
-                <w:rtl w:val="0"/>
-              </w:rPr>
-              <w:t xml:space="preserve">octubre</w:t>
+            </w:r>
+            <w:r>
+              <w:rPr>
+                <w:rtl w:val="0"/>
+              </w:rPr>
             </w:r>
             <w:r>
               <w:rPr>
@@ -1174,7 +1171,6 @@
                 <w:szCs w:val="20"/>
                 <w:rtl w:val="0"/>
               </w:rPr>
-              <w:t xml:space="preserve"> de 2026</w:t>
             </w:r>
             <w:r>
               <w:rPr>
@@ -1240,7 +1236,7 @@
               <w:rPr>
                 <w:rtl w:val="0"/>
               </w:rPr>
-              <w:t xml:space="preserve">02</w:t>
+              <w:t>10 de noviembre de 2026</w:t>
             </w:r>
             <w:r>
               <w:rPr>
@@ -1251,13 +1247,11 @@
                 <w:szCs w:val="20"/>
                 <w:rtl w:val="0"/>
               </w:rPr>
-              <w:t xml:space="preserve"> de </w:t>
-            </w:r>
-            <w:r>
-              <w:rPr>
-                <w:rtl w:val="0"/>
-              </w:rPr>
-              <w:t xml:space="preserve">octubre</w:t>
+            </w:r>
+            <w:r>
+              <w:rPr>
+                <w:rtl w:val="0"/>
+              </w:rPr>
             </w:r>
             <w:r>
               <w:rPr>
@@ -1268,7 +1262,6 @@
                 <w:szCs w:val="20"/>
                 <w:rtl w:val="0"/>
               </w:rPr>
-              <w:t xml:space="preserve"> de 2026</w:t>
             </w:r>
             <w:r>
               <w:rPr>
@@ -1334,7 +1327,7 @@
               <w:rPr>
                 <w:rtl w:val="0"/>
               </w:rPr>
-              <w:t xml:space="preserve">del 5</w:t>
+              <w:t>del 11 al 21 de noviembre de 2026</w:t>
             </w:r>
             <w:r>
               <w:rPr>
@@ -1345,7 +1338,6 @@
                 <w:szCs w:val="20"/>
                 <w:rtl w:val="0"/>
               </w:rPr>
-              <w:t xml:space="preserve"> el 16 de octubre de 2026</w:t>
             </w:r>
             <w:r>
               <w:rPr>
@@ -1416,7 +1408,7 @@
                 <w:szCs w:val="20"/>
                 <w:rtl w:val="0"/>
               </w:rPr>
-              <w:t xml:space="preserve">Viernes 30 de octubre de 2026</w:t>
+              <w:t>Viernes 27 de noviembre de 2026</w:t>
             </w:r>
             <w:r>
               <w:rPr>
@@ -1487,7 +1479,7 @@
                 <w:szCs w:val="20"/>
                 <w:rtl w:val="0"/>
               </w:rPr>
-              <w:t xml:space="preserve">6 de noviembre de 2026</w:t>
+              <w:t>2 de diciembre de 2026</w:t>
             </w:r>
             <w:r>
               <w:rPr>

</xml_diff>